<commit_message>
Fig 5: demote Panel F (per-subject predicted P) to Supp S8C
At N=35 with a modest AUC of 0.745 the 0.5-threshold view (14/35
misclassified, accuracy 0.60) visually undercuts the threshold-free
ranking claim carried by the ROC in Panel B.  Per-subject
transparency is still valuable for reviewers, but the right home is
the companion supplementary deck, not the headline figure.

- Fig 5 deck: 6 -> 5 slides (A-E)
- Supp S8 deck: 2 -> 3 slides (A: AUC bar, B: ROC overlay, C: per-
  subject predicted P, previously Fig 5F)
- 18_fig5_native_pptx.py: build_F() refactored to
  build_predicted_prob_panel(target_prs, panel_letter) so the same
  renderer produces the S8C slide on prs2.
- Manuscript v0.7.4: Fig 5 legend updated (A-F -> A-E, Panel F
  moved to S8C); Supp S8 description expanded to A-C with rationale
  that threshold-free AUC is the load-bearing metric.
- docx regenerated.
</commit_message>
<xml_diff>
--- a/manuscript/TNT_manuscript_v0.7.4_GenomeMedicine.docx
+++ b/manuscript/TNT_manuscript_v0.7.4_GenomeMedicine.docx
@@ -1371,7 +1371,7 @@
         <w:t xml:space="preserve">nested outer-LOOCV AUC of 0.745 (95 % CI 0.56–0.90) is the reference</w:t>
       </w:r>
       <w:r>
-        <w:t xml:space="preserve">. ElasticNet under the same nested procedure gives 0.745; RandomForest 0.58 (under-fits at n = 35). Per-subject predicted probabilities are in Fig 5F. The inclusion of both Thread-1 (DSB repair) and Thread-2-aligned (MHC II) features in a single small-N classifier, combined with the convergence-null result of §3.10 (baseline LASSO winners do not predict paired immune-cascade magnitude), argues that the two axes are statistically</w:t>
+        <w:t xml:space="preserve">. ElasticNet under the same nested procedure gives 0.745; RandomForest 0.58 (under-fits at n = 35). Per-subject predicted probabilities at the 0.5 threshold are provided in Supp Fig S8C for transparency; the threshold-free AUC in Fig 5B is the headline performance metric. The inclusion of both Thread-1 (DSB repair) and Thread-2-aligned (MHC II) features in a single small-N classifier, combined with the convergence-null result of §3.10 (baseline LASSO winners do not predict paired immune-cascade magnitude), argues that the two axes are statistically</w:t>
       </w:r>
       <w:r>
         <w:t xml:space="preserve"> </w:t>
@@ -3697,23 +3697,7 @@
         <w:t xml:space="preserve"> </w:t>
       </w:r>
       <w:r>
-        <w:t xml:space="preserve">SHAP beeswarm on the 4-feature model;</w:t>
-      </w:r>
-      <w:r>
-        <w:t xml:space="preserve"> </w:t>
-      </w:r>
-      <w:r>
-        <w:rPr>
-          <w:b/>
-          <w:bCs/>
-        </w:rPr>
-        <w:t xml:space="preserve">F</w:t>
-      </w:r>
-      <w:r>
-        <w:t xml:space="preserve"> </w:t>
-      </w:r>
-      <w:r>
-        <w:t xml:space="preserve">per-subject predicted probability.</w:t>
+        <w:t xml:space="preserve">SHAP beeswarm on the 4-feature model. Per-subject predicted probabilities at the 0.5 cut-off are shown in Supp Fig S8C for transparency; the main-figure performance claim rests on the threshold-free AUC in B.</w:t>
       </w:r>
     </w:p>
     <w:p>
@@ -4275,6 +4259,54 @@
       </w:r>
       <w:r>
         <w:t xml:space="preserve">ML model comparison (LASSO / ElasticNet / RandomForest, 5-scenario nested LOOCV).</w:t>
+      </w:r>
+      <w:r>
+        <w:t xml:space="preserve"> </w:t>
+      </w:r>
+      <w:r>
+        <w:rPr>
+          <w:b/>
+          <w:bCs/>
+        </w:rPr>
+        <w:t xml:space="preserve">A</w:t>
+      </w:r>
+      <w:r>
+        <w:t xml:space="preserve"> </w:t>
+      </w:r>
+      <w:r>
+        <w:t xml:space="preserve">AUC bar across five scenarios with 95 % bootstrap CI;</w:t>
+      </w:r>
+      <w:r>
+        <w:t xml:space="preserve"> </w:t>
+      </w:r>
+      <w:r>
+        <w:rPr>
+          <w:b/>
+          <w:bCs/>
+        </w:rPr>
+        <w:t xml:space="preserve">B</w:t>
+      </w:r>
+      <w:r>
+        <w:t xml:space="preserve"> </w:t>
+      </w:r>
+      <w:r>
+        <w:t xml:space="preserve">ROC overlay for all five scenarios;</w:t>
+      </w:r>
+      <w:r>
+        <w:t xml:space="preserve"> </w:t>
+      </w:r>
+      <w:r>
+        <w:rPr>
+          <w:b/>
+          <w:bCs/>
+        </w:rPr>
+        <w:t xml:space="preserve">C</w:t>
+      </w:r>
+      <w:r>
+        <w:t xml:space="preserve"> </w:t>
+      </w:r>
+      <w:r>
+        <w:t xml:space="preserve">per-subject predicted P(good) for the winning drop-CD8-proliferation ElasticNet (previously Fig 5F) — bars coloured by true label, 0.5 threshold annotated, misclassified subjects marked for per-patient transparency. The threshold-free AUC in Fig 5B is the load-bearing performance metric; the 0.5-threshold accuracy is provided here for reviewer reference but is not the headline claim.</w:t>
       </w:r>
     </w:p>
     <w:p>

</xml_diff>